<commit_message>
minor change in checkin report.
Former-commit-id: abf44a31908c0a4588b739a7dfd977daeef5e4ea
</commit_message>
<xml_diff>
--- a/Checkins/CheckinReport v0.4.1_10April2018.docx
+++ b/Checkins/CheckinReport v0.4.1_10April2018.docx
@@ -74,8 +74,6 @@
       <w:r>
         <w:t>068a5ddae6</w:t>
       </w:r>
-      <w:bookmarkStart w:id="0" w:name="_GoBack"/>
-      <w:bookmarkEnd w:id="0"/>
     </w:p>
     <w:p/>
     <w:p/>
@@ -223,7 +221,21 @@
     </w:p>
     <w:p>
       <w:r>
-        <w:t>This means that if a table “NewTab” is created in SE. Then you cannot create a table with name NEWTAB. It will report back saying that table exists.</w:t>
+        <w:t xml:space="preserve">This means that if a table “NewTab” is created in SE. Then you cannot create a table with name </w:t>
+      </w:r>
+      <w:r>
+        <w:t>“</w:t>
+      </w:r>
+      <w:r>
+        <w:t>NEWTAB</w:t>
+      </w:r>
+      <w:r>
+        <w:t>”</w:t>
+      </w:r>
+      <w:bookmarkStart w:id="0" w:name="_GoBack"/>
+      <w:bookmarkEnd w:id="0"/>
+      <w:r>
+        <w:t>. It will report back saying that table exists.</w:t>
       </w:r>
     </w:p>
     <w:sectPr>

</xml_diff>